<commit_message>
docs: add English report sections
</commit_message>
<xml_diff>
--- a/Fase 1/Evidencias Grupales/1.5_GuiaEstudiante_Fase 1_Definicion Proyecto APT (Español).docx
+++ b/Fase 1/Evidencias Grupales/1.5_GuiaEstudiante_Fase 1_Definicion Proyecto APT (Español).docx
@@ -831,1646 +831,448 @@
           <w:pPr>
             <w:widowControl w:val="0"/>
             <w:tabs>
-              <w:tab w:val="right" w:leader="none" w:pos="12000"/>
+              <w:tab w:val="right" w:leader="dot" w:pos="9360"/>
             </w:tabs>
             <w:spacing w:after="0" w:before="60" w:line="240" w:lineRule="auto"/>
+          </w:pPr>
+          <w:r>
             <w:rPr>
-              <w:rFonts w:ascii="Arial" w:cs="Arial" w:eastAsia="Arial" w:hAnsi="Arial"/>
+              <w:rFonts w:ascii="Calibri" w:hAnsi="Calibri" w:eastAsia="Calibri" w:cs="Calibri"/>
               <w:b w:val="1"/>
               <w:bCs w:val="1"/>
-              <w:i w:val="0"/>
-              <w:iCs w:val="0"/>
-              <w:smallCaps w:val="0"/>
-              <w:strike w:val="0"/>
               <w:color w:val="000000"/>
               <w:sz w:val="22"/>
               <w:szCs w:val="22"/>
-              <w:u w:val="none"/>
-              <w:shd w:fill="auto" w:val="clear"/>
-              <w:vertAlign w:val="baseline"/>
             </w:rPr>
-          </w:pPr>
-          <w:r>
-            <w:fldChar w:fldCharType="begin"/>
-            <w:instrText xml:space="preserve"> TOC \h \u \z \t "Heading 1,1,Heading 2,2,Heading 3,3,Heading 4,4,Heading 5,5,Heading 6,6,"</w:instrText>
-            <w:fldChar w:fldCharType="separate"/>
-          </w:r>
-          <w:hyperlink w:anchor="_heading=h.tsvaipc2dt49">
-            <w:r>
-              <w:rPr>
-                <w:rFonts w:ascii="Calibri" w:cs="Calibri" w:eastAsia="Calibri" w:hAnsi="Calibri"/>
-                <w:b w:val="1"/>
-                <w:bCs w:val="1"/>
-                <w:i w:val="0"/>
-                <w:iCs w:val="0"/>
-                <w:smallCaps w:val="0"/>
-                <w:strike w:val="0"/>
-                <w:color w:val="000000"/>
-                <w:sz w:val="22"/>
-                <w:szCs w:val="22"/>
-                <w:u w:val="none"/>
-                <w:shd w:fill="auto" w:val="clear"/>
-                <w:vertAlign w:val="baseline"/>
-                <w:rtl w:val="0"/>
-              </w:rPr>
-              <w:t xml:space="preserve">INTRODUCCIÓN</w:t>
-              <w:tab/>
-              <w:t xml:space="preserve">3</w:t>
-            </w:r>
-          </w:hyperlink>
-          <w:r>
-            <w:rPr>
-              <w:rtl w:val="0"/>
-            </w:rPr>
+            <w:t w:space="preserve">ABSTRACT</w:t>
+            <w:tab/>
+            <w:t w:space="preserve">3</w:t>
           </w:r>
         </w:p>
         <w:p>
           <w:pPr>
             <w:widowControl w:val="0"/>
             <w:tabs>
-              <w:tab w:val="right" w:leader="none" w:pos="12000"/>
+              <w:tab w:val="right" w:leader="dot" w:pos="9360"/>
             </w:tabs>
             <w:spacing w:after="0" w:before="60" w:line="240" w:lineRule="auto"/>
+          </w:pPr>
+          <w:r>
             <w:rPr>
-              <w:rFonts w:ascii="Arial" w:cs="Arial" w:eastAsia="Arial" w:hAnsi="Arial"/>
+              <w:rFonts w:ascii="Calibri" w:hAnsi="Calibri" w:eastAsia="Calibri" w:cs="Calibri"/>
               <w:b w:val="1"/>
               <w:bCs w:val="1"/>
-              <w:i w:val="0"/>
-              <w:iCs w:val="0"/>
-              <w:smallCaps w:val="0"/>
-              <w:strike w:val="0"/>
               <w:color w:val="000000"/>
               <w:sz w:val="22"/>
               <w:szCs w:val="22"/>
-              <w:u w:val="none"/>
-              <w:shd w:fill="auto" w:val="clear"/>
-              <w:vertAlign w:val="baseline"/>
             </w:rPr>
-          </w:pPr>
-          <w:hyperlink w:anchor="_heading=h.iklnied1bnrg">
-            <w:r>
-              <w:rPr>
-                <w:rFonts w:ascii="Calibri" w:cs="Calibri" w:eastAsia="Calibri" w:hAnsi="Calibri"/>
-                <w:b w:val="1"/>
-                <w:bCs w:val="1"/>
-                <w:i w:val="0"/>
-                <w:iCs w:val="0"/>
-                <w:smallCaps w:val="0"/>
-                <w:strike w:val="0"/>
-                <w:color w:val="000000"/>
-                <w:sz w:val="22"/>
-                <w:szCs w:val="22"/>
-                <w:u w:val="none"/>
-                <w:shd w:fill="auto" w:val="clear"/>
-                <w:vertAlign w:val="baseline"/>
-                <w:rtl w:val="0"/>
-              </w:rPr>
-              <w:t xml:space="preserve">I: DEFINICIÓN Y CONTEXTO DEL PROYECTO</w:t>
-              <w:tab/>
-              <w:t xml:space="preserve">3</w:t>
-            </w:r>
-          </w:hyperlink>
-          <w:r>
-            <w:rPr>
-              <w:rtl w:val="0"/>
-            </w:rPr>
+            <w:t w:space="preserve">RESUMEN</w:t>
+            <w:tab/>
+            <w:t w:space="preserve">3</w:t>
           </w:r>
         </w:p>
         <w:p>
           <w:pPr>
             <w:widowControl w:val="0"/>
             <w:tabs>
-              <w:tab w:val="right" w:leader="none" w:pos="12000"/>
+              <w:tab w:val="right" w:leader="dot" w:pos="9360"/>
             </w:tabs>
             <w:spacing w:after="0" w:before="60" w:line="240" w:lineRule="auto"/>
-            <w:ind w:left="360" w:firstLine="0"/>
+          </w:pPr>
+          <w:r>
             <w:rPr>
-              <w:rFonts w:ascii="Arial" w:cs="Arial" w:eastAsia="Arial" w:hAnsi="Arial"/>
-              <w:b w:val="0"/>
-              <w:bCs w:val="0"/>
-              <w:i w:val="0"/>
-              <w:iCs w:val="0"/>
-              <w:smallCaps w:val="0"/>
-              <w:strike w:val="0"/>
+              <w:rFonts w:ascii="Calibri" w:hAnsi="Calibri" w:eastAsia="Calibri" w:cs="Calibri"/>
+              <w:b w:val="1"/>
+              <w:bCs w:val="1"/>
               <w:color w:val="000000"/>
               <w:sz w:val="22"/>
               <w:szCs w:val="22"/>
-              <w:u w:val="none"/>
-              <w:shd w:fill="auto" w:val="clear"/>
-              <w:vertAlign w:val="baseline"/>
             </w:rPr>
-          </w:pPr>
-          <w:hyperlink w:anchor="_heading=h.josnt27larj8">
-            <w:r>
-              <w:rPr>
-                <w:rFonts w:ascii="Calibri" w:cs="Calibri" w:eastAsia="Calibri" w:hAnsi="Calibri"/>
-                <w:b w:val="0"/>
-                <w:bCs w:val="0"/>
-                <w:i w:val="0"/>
-                <w:iCs w:val="0"/>
-                <w:smallCaps w:val="0"/>
-                <w:strike w:val="0"/>
-                <w:color w:val="000000"/>
-                <w:sz w:val="22"/>
-                <w:szCs w:val="22"/>
-                <w:u w:val="none"/>
-                <w:shd w:fill="auto" w:val="clear"/>
-                <w:vertAlign w:val="baseline"/>
-                <w:rtl w:val="0"/>
-              </w:rPr>
-              <w:t xml:space="preserve">1.1 Antecedentes Generales y del Equipo</w:t>
-              <w:tab/>
-              <w:t xml:space="preserve">3</w:t>
-            </w:r>
-          </w:hyperlink>
-          <w:r>
-            <w:rPr>
-              <w:rtl w:val="0"/>
-            </w:rPr>
+            <w:t w:space="preserve">INTRODUCCIÓN</w:t>
+            <w:tab/>
+            <w:t w:space="preserve">4</w:t>
           </w:r>
         </w:p>
         <w:p>
           <w:pPr>
             <w:widowControl w:val="0"/>
             <w:tabs>
-              <w:tab w:val="right" w:leader="none" w:pos="12000"/>
+              <w:tab w:val="right" w:leader="dot" w:pos="9360"/>
             </w:tabs>
             <w:spacing w:after="0" w:before="60" w:line="240" w:lineRule="auto"/>
-            <w:ind w:left="360" w:firstLine="0"/>
+          </w:pPr>
+          <w:r>
             <w:rPr>
-              <w:rFonts w:ascii="Arial" w:cs="Arial" w:eastAsia="Arial" w:hAnsi="Arial"/>
-              <w:b w:val="0"/>
-              <w:bCs w:val="0"/>
-              <w:i w:val="0"/>
-              <w:iCs w:val="0"/>
-              <w:smallCaps w:val="0"/>
-              <w:strike w:val="0"/>
+              <w:rFonts w:ascii="Calibri" w:hAnsi="Calibri" w:eastAsia="Calibri" w:cs="Calibri"/>
+              <w:b w:val="1"/>
+              <w:bCs w:val="1"/>
               <w:color w:val="000000"/>
               <w:sz w:val="22"/>
               <w:szCs w:val="22"/>
-              <w:u w:val="none"/>
-              <w:shd w:fill="auto" w:val="clear"/>
-              <w:vertAlign w:val="baseline"/>
             </w:rPr>
-          </w:pPr>
-          <w:hyperlink w:anchor="_heading=h.fhyubvtgds10">
-            <w:r>
-              <w:rPr>
-                <w:rFonts w:ascii="Calibri" w:cs="Calibri" w:eastAsia="Calibri" w:hAnsi="Calibri"/>
-                <w:b w:val="0"/>
-                <w:bCs w:val="0"/>
-                <w:i w:val="0"/>
-                <w:iCs w:val="0"/>
-                <w:smallCaps w:val="0"/>
-                <w:strike w:val="0"/>
-                <w:color w:val="000000"/>
-                <w:sz w:val="22"/>
-                <w:szCs w:val="22"/>
-                <w:u w:val="none"/>
-                <w:shd w:fill="auto" w:val="clear"/>
-                <w:vertAlign w:val="baseline"/>
-                <w:rtl w:val="0"/>
-              </w:rPr>
-              <w:t xml:space="preserve">1.2 Descripción del Proyecto APT y Relevancia en el Campo Laboral</w:t>
-              <w:tab/>
-              <w:t xml:space="preserve">4</w:t>
-            </w:r>
-          </w:hyperlink>
-          <w:r>
-            <w:rPr>
-              <w:rtl w:val="0"/>
-            </w:rPr>
+            <w:t w:space="preserve">I: DEFINICIÓN Y CONTEXTO DEL PROYECTO</w:t>
+            <w:tab/>
+            <w:t w:space="preserve">4</w:t>
           </w:r>
         </w:p>
         <w:p>
           <w:pPr>
             <w:widowControl w:val="0"/>
             <w:tabs>
-              <w:tab w:val="right" w:leader="none" w:pos="12000"/>
+              <w:tab w:val="right" w:leader="dot" w:pos="9360"/>
             </w:tabs>
             <w:spacing w:after="0" w:before="60" w:line="240" w:lineRule="auto"/>
-            <w:ind w:left="720" w:firstLine="0"/>
+            <w:ind w:left="360" w:firstLine="0"/>
+          </w:pPr>
+          <w:r>
             <w:rPr>
-              <w:rFonts w:ascii="Arial" w:cs="Arial" w:eastAsia="Arial" w:hAnsi="Arial"/>
-              <w:b w:val="0"/>
-              <w:bCs w:val="0"/>
-              <w:i w:val="0"/>
-              <w:iCs w:val="0"/>
-              <w:smallCaps w:val="0"/>
-              <w:strike w:val="0"/>
+              <w:rFonts w:ascii="Calibri" w:hAnsi="Calibri" w:eastAsia="Calibri" w:cs="Calibri"/>
               <w:color w:val="000000"/>
               <w:sz w:val="22"/>
               <w:szCs w:val="22"/>
-              <w:u w:val="none"/>
-              <w:shd w:fill="auto" w:val="clear"/>
-              <w:vertAlign w:val="baseline"/>
             </w:rPr>
-          </w:pPr>
-          <w:hyperlink w:anchor="_heading=h.wmsx5fvuekd">
-            <w:r>
-              <w:rPr>
-                <w:rFonts w:ascii="Calibri" w:cs="Calibri" w:eastAsia="Calibri" w:hAnsi="Calibri"/>
-                <w:b w:val="0"/>
-                <w:bCs w:val="0"/>
-                <w:i w:val="0"/>
-                <w:iCs w:val="0"/>
-                <w:smallCaps w:val="0"/>
-                <w:strike w:val="0"/>
-                <w:color w:val="000000"/>
-                <w:sz w:val="22"/>
-                <w:szCs w:val="22"/>
-                <w:u w:val="none"/>
-                <w:shd w:fill="auto" w:val="clear"/>
-                <w:vertAlign w:val="baseline"/>
-                <w:rtl w:val="0"/>
-              </w:rPr>
-              <w:t xml:space="preserve">1.2.1 Descripción del Proyecto: ACE (Autonomous Content Engine)</w:t>
-              <w:tab/>
-              <w:t xml:space="preserve">4</w:t>
-            </w:r>
-          </w:hyperlink>
-          <w:r>
-            <w:rPr>
-              <w:rtl w:val="0"/>
-            </w:rPr>
+            <w:t w:space="preserve">1.1 Antecedentes Generales y del Equipo</w:t>
+            <w:tab/>
+            <w:t w:space="preserve">4</w:t>
           </w:r>
         </w:p>
         <w:p>
           <w:pPr>
             <w:widowControl w:val="0"/>
             <w:tabs>
-              <w:tab w:val="right" w:leader="none" w:pos="12000"/>
+              <w:tab w:val="right" w:leader="dot" w:pos="9360"/>
             </w:tabs>
             <w:spacing w:after="0" w:before="60" w:line="240" w:lineRule="auto"/>
-            <w:ind w:left="720" w:firstLine="0"/>
+            <w:ind w:left="360" w:firstLine="0"/>
+          </w:pPr>
+          <w:r>
             <w:rPr>
-              <w:rFonts w:ascii="Arial" w:cs="Arial" w:eastAsia="Arial" w:hAnsi="Arial"/>
-              <w:b w:val="0"/>
-              <w:bCs w:val="0"/>
-              <w:i w:val="0"/>
-              <w:iCs w:val="0"/>
-              <w:smallCaps w:val="0"/>
-              <w:strike w:val="0"/>
+              <w:rFonts w:ascii="Calibri" w:hAnsi="Calibri" w:eastAsia="Calibri" w:cs="Calibri"/>
               <w:color w:val="000000"/>
               <w:sz w:val="22"/>
               <w:szCs w:val="22"/>
-              <w:u w:val="none"/>
-              <w:shd w:fill="auto" w:val="clear"/>
-              <w:vertAlign w:val="baseline"/>
             </w:rPr>
-          </w:pPr>
-          <w:hyperlink w:anchor="_heading=h.qg8iqlhupppz">
-            <w:r>
-              <w:rPr>
-                <w:rFonts w:ascii="Calibri" w:cs="Calibri" w:eastAsia="Calibri" w:hAnsi="Calibri"/>
-                <w:b w:val="0"/>
-                <w:bCs w:val="0"/>
-                <w:i w:val="0"/>
-                <w:iCs w:val="0"/>
-                <w:smallCaps w:val="0"/>
-                <w:strike w:val="0"/>
-                <w:color w:val="000000"/>
-                <w:sz w:val="22"/>
-                <w:szCs w:val="22"/>
-                <w:u w:val="none"/>
-                <w:shd w:fill="auto" w:val="clear"/>
-                <w:vertAlign w:val="baseline"/>
-                <w:rtl w:val="0"/>
-              </w:rPr>
-              <w:t xml:space="preserve">1.2.2 Relevancia, Impacto y Beneficio en el Campo Laboral</w:t>
-              <w:tab/>
-              <w:t xml:space="preserve">5</w:t>
-            </w:r>
-          </w:hyperlink>
-          <w:r>
-            <w:rPr>
-              <w:rtl w:val="0"/>
-            </w:rPr>
+            <w:t w:space="preserve">1.2 Descripción del Proyecto APT y Relevancia en el Campo Laboral</w:t>
+            <w:tab/>
+            <w:t w:space="preserve">5</w:t>
           </w:r>
         </w:p>
         <w:p>
           <w:pPr>
             <w:widowControl w:val="0"/>
             <w:tabs>
-              <w:tab w:val="right" w:leader="none" w:pos="12000"/>
+              <w:tab w:val="right" w:leader="dot" w:pos="9360"/>
             </w:tabs>
             <w:spacing w:after="0" w:before="60" w:line="240" w:lineRule="auto"/>
             <w:ind w:left="360" w:firstLine="0"/>
+          </w:pPr>
+          <w:r>
             <w:rPr>
-              <w:rFonts w:ascii="Arial" w:cs="Arial" w:eastAsia="Arial" w:hAnsi="Arial"/>
-              <w:b w:val="0"/>
-              <w:bCs w:val="0"/>
-              <w:i w:val="0"/>
-              <w:iCs w:val="0"/>
-              <w:smallCaps w:val="0"/>
-              <w:strike w:val="0"/>
+              <w:rFonts w:ascii="Calibri" w:hAnsi="Calibri" w:eastAsia="Calibri" w:cs="Calibri"/>
               <w:color w:val="000000"/>
               <w:sz w:val="22"/>
               <w:szCs w:val="22"/>
-              <w:u w:val="none"/>
-              <w:shd w:fill="auto" w:val="clear"/>
-              <w:vertAlign w:val="baseline"/>
             </w:rPr>
-          </w:pPr>
-          <w:hyperlink w:anchor="_heading=h.hsf0rg4nv3ug">
-            <w:r>
-              <w:rPr>
-                <w:rFonts w:ascii="Calibri" w:cs="Calibri" w:eastAsia="Calibri" w:hAnsi="Calibri"/>
-                <w:b w:val="0"/>
-                <w:bCs w:val="0"/>
-                <w:i w:val="0"/>
-                <w:iCs w:val="0"/>
-                <w:smallCaps w:val="0"/>
-                <w:strike w:val="0"/>
-                <w:color w:val="000000"/>
-                <w:sz w:val="22"/>
-                <w:szCs w:val="22"/>
-                <w:u w:val="none"/>
-                <w:shd w:fill="auto" w:val="clear"/>
-                <w:vertAlign w:val="baseline"/>
-                <w:rtl w:val="0"/>
-              </w:rPr>
-              <w:t xml:space="preserve">1.3 Relación con las Competencias del Perfil de Egreso</w:t>
-              <w:tab/>
-              <w:t xml:space="preserve">5</w:t>
-            </w:r>
-          </w:hyperlink>
-          <w:r>
-            <w:rPr>
-              <w:rtl w:val="0"/>
-            </w:rPr>
+            <w:t w:space="preserve">1.3 Relación con las Competencias del Perfil de Egreso</w:t>
+            <w:tab/>
+            <w:t w:space="preserve">6</w:t>
           </w:r>
         </w:p>
         <w:p>
           <w:pPr>
             <w:widowControl w:val="0"/>
             <w:tabs>
-              <w:tab w:val="right" w:leader="none" w:pos="12000"/>
+              <w:tab w:val="right" w:leader="dot" w:pos="9360"/>
             </w:tabs>
             <w:spacing w:after="0" w:before="60" w:line="240" w:lineRule="auto"/>
             <w:ind w:left="360" w:firstLine="0"/>
+          </w:pPr>
+          <w:r>
             <w:rPr>
-              <w:rFonts w:ascii="Arial" w:cs="Arial" w:eastAsia="Arial" w:hAnsi="Arial"/>
-              <w:b w:val="0"/>
-              <w:bCs w:val="0"/>
-              <w:i w:val="0"/>
-              <w:iCs w:val="0"/>
-              <w:smallCaps w:val="0"/>
-              <w:strike w:val="0"/>
+              <w:rFonts w:ascii="Calibri" w:hAnsi="Calibri" w:eastAsia="Calibri" w:cs="Calibri"/>
               <w:color w:val="000000"/>
               <w:sz w:val="22"/>
               <w:szCs w:val="22"/>
-              <w:u w:val="none"/>
-              <w:shd w:fill="auto" w:val="clear"/>
-              <w:vertAlign w:val="baseline"/>
             </w:rPr>
-          </w:pPr>
-          <w:hyperlink w:anchor="_heading=h.wu4ro6en6gyz">
-            <w:r>
-              <w:rPr>
-                <w:rFonts w:ascii="Calibri" w:cs="Calibri" w:eastAsia="Calibri" w:hAnsi="Calibri"/>
-                <w:b w:val="0"/>
-                <w:bCs w:val="0"/>
-                <w:i w:val="0"/>
-                <w:iCs w:val="0"/>
-                <w:smallCaps w:val="0"/>
-                <w:strike w:val="0"/>
-                <w:color w:val="000000"/>
-                <w:sz w:val="22"/>
-                <w:szCs w:val="22"/>
-                <w:u w:val="none"/>
-                <w:shd w:fill="auto" w:val="clear"/>
-                <w:vertAlign w:val="baseline"/>
-                <w:rtl w:val="0"/>
-              </w:rPr>
-              <w:t xml:space="preserve">1.4 Relación del Proyecto con los Intereses Profesionales</w:t>
-              <w:tab/>
-              <w:t xml:space="preserve">6</w:t>
-            </w:r>
-          </w:hyperlink>
-          <w:r>
-            <w:rPr>
-              <w:rtl w:val="0"/>
-            </w:rPr>
+            <w:t w:space="preserve">1.4 Relación del Proyecto con los Intereses Profesionales</w:t>
+            <w:tab/>
+            <w:t w:space="preserve">7</w:t>
           </w:r>
         </w:p>
         <w:p>
           <w:pPr>
             <w:widowControl w:val="0"/>
             <w:tabs>
-              <w:tab w:val="right" w:leader="none" w:pos="12000"/>
+              <w:tab w:val="right" w:leader="dot" w:pos="9360"/>
             </w:tabs>
             <w:spacing w:after="0" w:before="60" w:line="240" w:lineRule="auto"/>
-            <w:ind w:left="720" w:firstLine="0"/>
+            <w:ind w:left="360" w:firstLine="0"/>
+          </w:pPr>
+          <w:r>
             <w:rPr>
-              <w:rFonts w:ascii="Arial" w:cs="Arial" w:eastAsia="Arial" w:hAnsi="Arial"/>
-              <w:b w:val="0"/>
-              <w:bCs w:val="0"/>
-              <w:i w:val="0"/>
-              <w:iCs w:val="0"/>
-              <w:smallCaps w:val="0"/>
-              <w:strike w:val="0"/>
+              <w:rFonts w:ascii="Calibri" w:hAnsi="Calibri" w:eastAsia="Calibri" w:cs="Calibri"/>
               <w:color w:val="000000"/>
               <w:sz w:val="22"/>
               <w:szCs w:val="22"/>
-              <w:u w:val="none"/>
-              <w:shd w:fill="auto" w:val="clear"/>
-              <w:vertAlign w:val="baseline"/>
             </w:rPr>
-          </w:pPr>
-          <w:hyperlink w:anchor="_heading=h.wc32q3doo5nt">
-            <w:r>
-              <w:rPr>
-                <w:rFonts w:ascii="Calibri" w:cs="Calibri" w:eastAsia="Calibri" w:hAnsi="Calibri"/>
-                <w:b w:val="0"/>
-                <w:bCs w:val="0"/>
-                <w:i w:val="0"/>
-                <w:iCs w:val="0"/>
-                <w:smallCaps w:val="0"/>
-                <w:strike w:val="0"/>
-                <w:color w:val="000000"/>
-                <w:sz w:val="22"/>
-                <w:szCs w:val="22"/>
-                <w:u w:val="none"/>
-                <w:shd w:fill="auto" w:val="clear"/>
-                <w:vertAlign w:val="baseline"/>
-                <w:rtl w:val="0"/>
-              </w:rPr>
-              <w:t xml:space="preserve">1.4.1 Paulo Loyola</w:t>
-              <w:tab/>
-              <w:t xml:space="preserve">6</w:t>
-            </w:r>
-          </w:hyperlink>
-          <w:r>
-            <w:rPr>
-              <w:rtl w:val="0"/>
-            </w:rPr>
+            <w:t w:space="preserve">1.5 Factibilidad del Proyecto en el Marco de la Asignatura</w:t>
+            <w:tab/>
+            <w:t w:space="preserve">8</w:t>
           </w:r>
         </w:p>
         <w:p>
           <w:pPr>
             <w:widowControl w:val="0"/>
             <w:tabs>
-              <w:tab w:val="right" w:leader="none" w:pos="12000"/>
+              <w:tab w:val="right" w:leader="dot" w:pos="9360"/>
             </w:tabs>
             <w:spacing w:after="0" w:before="60" w:line="240" w:lineRule="auto"/>
-            <w:ind w:left="720" w:firstLine="0"/>
+          </w:pPr>
+          <w:r>
             <w:rPr>
-              <w:rFonts w:ascii="Arial" w:cs="Arial" w:eastAsia="Arial" w:hAnsi="Arial"/>
-              <w:b w:val="0"/>
-              <w:bCs w:val="0"/>
-              <w:i w:val="0"/>
-              <w:iCs w:val="0"/>
-              <w:smallCaps w:val="0"/>
-              <w:strike w:val="0"/>
+              <w:rFonts w:ascii="Calibri" w:hAnsi="Calibri" w:eastAsia="Calibri" w:cs="Calibri"/>
+              <w:b w:val="1"/>
+              <w:bCs w:val="1"/>
               <w:color w:val="000000"/>
               <w:sz w:val="22"/>
               <w:szCs w:val="22"/>
-              <w:u w:val="none"/>
-              <w:shd w:fill="auto" w:val="clear"/>
-              <w:vertAlign w:val="baseline"/>
             </w:rPr>
-          </w:pPr>
-          <w:hyperlink w:anchor="_heading=h.nln85i63hxpn">
-            <w:r>
-              <w:rPr>
-                <w:rFonts w:ascii="Calibri" w:cs="Calibri" w:eastAsia="Calibri" w:hAnsi="Calibri"/>
-                <w:b w:val="0"/>
-                <w:bCs w:val="0"/>
-                <w:i w:val="0"/>
-                <w:iCs w:val="0"/>
-                <w:smallCaps w:val="0"/>
-                <w:strike w:val="0"/>
-                <w:color w:val="000000"/>
-                <w:sz w:val="22"/>
-                <w:szCs w:val="22"/>
-                <w:u w:val="none"/>
-                <w:shd w:fill="auto" w:val="clear"/>
-                <w:vertAlign w:val="baseline"/>
-                <w:rtl w:val="0"/>
-              </w:rPr>
-              <w:t xml:space="preserve">1.4.2 Tomás Escalante</w:t>
-              <w:tab/>
-              <w:t xml:space="preserve">6</w:t>
-            </w:r>
-          </w:hyperlink>
-          <w:r>
-            <w:rPr>
-              <w:rtl w:val="0"/>
-            </w:rPr>
+            <w:t w:space="preserve">II: OBJETIVOS, METODOLOGÍA Y PLANIFICACIÓN</w:t>
+            <w:tab/>
+            <w:t w:space="preserve">11</w:t>
           </w:r>
         </w:p>
         <w:p>
           <w:pPr>
             <w:widowControl w:val="0"/>
             <w:tabs>
-              <w:tab w:val="right" w:leader="none" w:pos="12000"/>
+              <w:tab w:val="right" w:leader="dot" w:pos="9360"/>
             </w:tabs>
             <w:spacing w:after="0" w:before="60" w:line="240" w:lineRule="auto"/>
-            <w:ind w:left="720" w:firstLine="0"/>
+            <w:ind w:left="360" w:firstLine="0"/>
+          </w:pPr>
+          <w:r>
             <w:rPr>
-              <w:rFonts w:ascii="Arial" w:cs="Arial" w:eastAsia="Arial" w:hAnsi="Arial"/>
-              <w:b w:val="0"/>
-              <w:bCs w:val="0"/>
-              <w:i w:val="0"/>
-              <w:iCs w:val="0"/>
-              <w:smallCaps w:val="0"/>
-              <w:strike w:val="0"/>
+              <w:rFonts w:ascii="Calibri" w:hAnsi="Calibri" w:eastAsia="Calibri" w:cs="Calibri"/>
               <w:color w:val="000000"/>
               <w:sz w:val="22"/>
               <w:szCs w:val="22"/>
-              <w:u w:val="none"/>
-              <w:shd w:fill="auto" w:val="clear"/>
-              <w:vertAlign w:val="baseline"/>
             </w:rPr>
-          </w:pPr>
-          <w:hyperlink w:anchor="_heading=h.rqvjlu6rhws6">
-            <w:r>
-              <w:rPr>
-                <w:rFonts w:ascii="Calibri" w:cs="Calibri" w:eastAsia="Calibri" w:hAnsi="Calibri"/>
-                <w:b w:val="0"/>
-                <w:bCs w:val="0"/>
-                <w:i w:val="0"/>
-                <w:iCs w:val="0"/>
-                <w:smallCaps w:val="0"/>
-                <w:strike w:val="0"/>
-                <w:color w:val="000000"/>
-                <w:sz w:val="22"/>
-                <w:szCs w:val="22"/>
-                <w:u w:val="none"/>
-                <w:shd w:fill="auto" w:val="clear"/>
-                <w:vertAlign w:val="baseline"/>
-                <w:rtl w:val="0"/>
-              </w:rPr>
-              <w:t xml:space="preserve">1.4.3 Matías Salas</w:t>
-              <w:tab/>
-              <w:t xml:space="preserve">7</w:t>
-            </w:r>
-          </w:hyperlink>
-          <w:r>
-            <w:rPr>
-              <w:rtl w:val="0"/>
-            </w:rPr>
+            <w:t w:space="preserve">2.1 Formulación de Objetivos</w:t>
+            <w:tab/>
+            <w:t w:space="preserve">11</w:t>
           </w:r>
         </w:p>
         <w:p>
           <w:pPr>
             <w:widowControl w:val="0"/>
             <w:tabs>
-              <w:tab w:val="right" w:leader="none" w:pos="12000"/>
+              <w:tab w:val="right" w:leader="dot" w:pos="9360"/>
             </w:tabs>
             <w:spacing w:after="0" w:before="60" w:line="240" w:lineRule="auto"/>
             <w:ind w:left="360" w:firstLine="0"/>
+          </w:pPr>
+          <w:r>
             <w:rPr>
-              <w:rFonts w:ascii="Arial" w:cs="Arial" w:eastAsia="Arial" w:hAnsi="Arial"/>
-              <w:b w:val="0"/>
-              <w:bCs w:val="0"/>
-              <w:i w:val="0"/>
-              <w:iCs w:val="0"/>
-              <w:smallCaps w:val="0"/>
-              <w:strike w:val="0"/>
+              <w:rFonts w:ascii="Calibri" w:hAnsi="Calibri" w:eastAsia="Calibri" w:cs="Calibri"/>
               <w:color w:val="000000"/>
               <w:sz w:val="22"/>
               <w:szCs w:val="22"/>
-              <w:u w:val="none"/>
-              <w:shd w:fill="auto" w:val="clear"/>
-              <w:vertAlign w:val="baseline"/>
             </w:rPr>
-          </w:pPr>
-          <w:hyperlink w:anchor="_heading=h.3fne4z30hwks">
-            <w:r>
-              <w:rPr>
-                <w:rFonts w:ascii="Calibri" w:cs="Calibri" w:eastAsia="Calibri" w:hAnsi="Calibri"/>
-                <w:b w:val="0"/>
-                <w:bCs w:val="0"/>
-                <w:i w:val="0"/>
-                <w:iCs w:val="0"/>
-                <w:smallCaps w:val="0"/>
-                <w:strike w:val="0"/>
-                <w:color w:val="000000"/>
-                <w:sz w:val="22"/>
-                <w:szCs w:val="22"/>
-                <w:u w:val="none"/>
-                <w:shd w:fill="auto" w:val="clear"/>
-                <w:vertAlign w:val="baseline"/>
-                <w:rtl w:val="0"/>
-              </w:rPr>
-              <w:t xml:space="preserve">1.5 Factibilidad del Proyecto en el Marco de la Asignatura</w:t>
-              <w:tab/>
-              <w:t xml:space="preserve">7</w:t>
-            </w:r>
-          </w:hyperlink>
-          <w:r>
-            <w:rPr>
-              <w:rtl w:val="0"/>
-            </w:rPr>
+            <w:t w:space="preserve">2.2 Metodología de Trabajo y Roles Disciplinares</w:t>
+            <w:tab/>
+            <w:t w:space="preserve">12</w:t>
           </w:r>
         </w:p>
         <w:p>
           <w:pPr>
             <w:widowControl w:val="0"/>
             <w:tabs>
-              <w:tab w:val="right" w:leader="none" w:pos="12000"/>
+              <w:tab w:val="right" w:leader="dot" w:pos="9360"/>
             </w:tabs>
             <w:spacing w:after="0" w:before="60" w:line="240" w:lineRule="auto"/>
-            <w:ind w:left="720" w:firstLine="0"/>
+            <w:ind w:left="360" w:firstLine="0"/>
+          </w:pPr>
+          <w:r>
             <w:rPr>
-              <w:rFonts w:ascii="Arial" w:cs="Arial" w:eastAsia="Arial" w:hAnsi="Arial"/>
-              <w:b w:val="0"/>
-              <w:bCs w:val="0"/>
-              <w:i w:val="0"/>
-              <w:iCs w:val="0"/>
-              <w:smallCaps w:val="0"/>
-              <w:strike w:val="0"/>
+              <w:rFonts w:ascii="Calibri" w:hAnsi="Calibri" w:eastAsia="Calibri" w:cs="Calibri"/>
               <w:color w:val="000000"/>
               <w:sz w:val="22"/>
               <w:szCs w:val="22"/>
-              <w:u w:val="none"/>
-              <w:shd w:fill="auto" w:val="clear"/>
-              <w:vertAlign w:val="baseline"/>
             </w:rPr>
-          </w:pPr>
-          <w:hyperlink w:anchor="_heading=h.98vl3q91usm1">
-            <w:r>
-              <w:rPr>
-                <w:rFonts w:ascii="Calibri" w:cs="Calibri" w:eastAsia="Calibri" w:hAnsi="Calibri"/>
-                <w:b w:val="0"/>
-                <w:bCs w:val="0"/>
-                <w:i w:val="0"/>
-                <w:iCs w:val="0"/>
-                <w:smallCaps w:val="0"/>
-                <w:strike w:val="0"/>
-                <w:color w:val="000000"/>
-                <w:sz w:val="22"/>
-                <w:szCs w:val="22"/>
-                <w:u w:val="none"/>
-                <w:shd w:fill="auto" w:val="clear"/>
-                <w:vertAlign w:val="baseline"/>
-                <w:rtl w:val="0"/>
-              </w:rPr>
-              <w:t xml:space="preserve">1.5.1 Factibilidad Temporal</w:t>
-              <w:tab/>
-              <w:t xml:space="preserve">7</w:t>
-            </w:r>
-          </w:hyperlink>
-          <w:r>
-            <w:rPr>
-              <w:rtl w:val="0"/>
-            </w:rPr>
+            <w:t w:space="preserve">2.3 Plan de Trabajo Articulado por Competencias</w:t>
+            <w:tab/>
+            <w:t w:space="preserve">13</w:t>
           </w:r>
         </w:p>
         <w:p>
           <w:pPr>
             <w:widowControl w:val="0"/>
             <w:tabs>
-              <w:tab w:val="right" w:leader="none" w:pos="12000"/>
+              <w:tab w:val="right" w:leader="dot" w:pos="9360"/>
             </w:tabs>
             <w:spacing w:after="0" w:before="60" w:line="240" w:lineRule="auto"/>
-            <w:ind w:left="720" w:firstLine="0"/>
+            <w:ind w:left="360" w:firstLine="0"/>
+          </w:pPr>
+          <w:r>
             <w:rPr>
-              <w:rFonts w:ascii="Arial" w:cs="Arial" w:eastAsia="Arial" w:hAnsi="Arial"/>
-              <w:b w:val="0"/>
-              <w:bCs w:val="0"/>
-              <w:i w:val="0"/>
-              <w:iCs w:val="0"/>
-              <w:smallCaps w:val="0"/>
-              <w:strike w:val="0"/>
+              <w:rFonts w:ascii="Calibri" w:hAnsi="Calibri" w:eastAsia="Calibri" w:cs="Calibri"/>
               <w:color w:val="000000"/>
               <w:sz w:val="22"/>
               <w:szCs w:val="22"/>
-              <w:u w:val="none"/>
-              <w:shd w:fill="auto" w:val="clear"/>
-              <w:vertAlign w:val="baseline"/>
             </w:rPr>
-          </w:pPr>
-          <w:hyperlink w:anchor="_heading=h.8t4x5b9leec9">
-            <w:r>
-              <w:rPr>
-                <w:rFonts w:ascii="Calibri" w:cs="Calibri" w:eastAsia="Calibri" w:hAnsi="Calibri"/>
-                <w:b w:val="0"/>
-                <w:bCs w:val="0"/>
-                <w:i w:val="0"/>
-                <w:iCs w:val="0"/>
-                <w:smallCaps w:val="0"/>
-                <w:strike w:val="0"/>
-                <w:color w:val="000000"/>
-                <w:sz w:val="22"/>
-                <w:szCs w:val="22"/>
-                <w:u w:val="none"/>
-                <w:shd w:fill="auto" w:val="clear"/>
-                <w:vertAlign w:val="baseline"/>
-                <w:rtl w:val="0"/>
-              </w:rPr>
-              <w:t xml:space="preserve">1.5.2 Factibilidad Técnica y de Recursos</w:t>
-              <w:tab/>
-              <w:t xml:space="preserve">7</w:t>
-            </w:r>
-          </w:hyperlink>
-          <w:r>
-            <w:rPr>
-              <w:rtl w:val="0"/>
-            </w:rPr>
+            <w:t w:space="preserve">2.4 Determinación y Justificación de Evidencias</w:t>
+            <w:tab/>
+            <w:t w:space="preserve">16</w:t>
           </w:r>
         </w:p>
         <w:p>
           <w:pPr>
             <w:widowControl w:val="0"/>
             <w:tabs>
-              <w:tab w:val="right" w:leader="none" w:pos="12000"/>
+              <w:tab w:val="right" w:leader="dot" w:pos="9360"/>
             </w:tabs>
             <w:spacing w:after="0" w:before="60" w:line="240" w:lineRule="auto"/>
-            <w:ind w:left="720" w:firstLine="0"/>
+            <w:ind w:left="360" w:firstLine="0"/>
+          </w:pPr>
+          <w:r>
             <w:rPr>
-              <w:rFonts w:ascii="Arial" w:cs="Arial" w:eastAsia="Arial" w:hAnsi="Arial"/>
-              <w:b w:val="0"/>
-              <w:bCs w:val="0"/>
-              <w:i w:val="0"/>
-              <w:iCs w:val="0"/>
-              <w:smallCaps w:val="0"/>
-              <w:strike w:val="0"/>
+              <w:rFonts w:ascii="Calibri" w:hAnsi="Calibri" w:eastAsia="Calibri" w:cs="Calibri"/>
               <w:color w:val="000000"/>
               <w:sz w:val="22"/>
               <w:szCs w:val="22"/>
-              <w:u w:val="none"/>
-              <w:shd w:fill="auto" w:val="clear"/>
-              <w:vertAlign w:val="baseline"/>
             </w:rPr>
-          </w:pPr>
-          <w:hyperlink w:anchor="_heading=h.de48t4gtiegb">
-            <w:r>
-              <w:rPr>
-                <w:rFonts w:ascii="Calibri" w:cs="Calibri" w:eastAsia="Calibri" w:hAnsi="Calibri"/>
-                <w:b w:val="0"/>
-                <w:bCs w:val="0"/>
-                <w:i w:val="0"/>
-                <w:iCs w:val="0"/>
-                <w:smallCaps w:val="0"/>
-                <w:strike w:val="0"/>
-                <w:color w:val="000000"/>
-                <w:sz w:val="22"/>
-                <w:szCs w:val="22"/>
-                <w:u w:val="none"/>
-                <w:shd w:fill="auto" w:val="clear"/>
-                <w:vertAlign w:val="baseline"/>
-                <w:rtl w:val="0"/>
-              </w:rPr>
-              <w:t xml:space="preserve">1.5.3 Factores Facilitadores</w:t>
-              <w:tab/>
-              <w:t xml:space="preserve">7</w:t>
-            </w:r>
-          </w:hyperlink>
-          <w:r>
-            <w:rPr>
-              <w:rtl w:val="0"/>
-            </w:rPr>
+            <w:t w:space="preserve">2.5 Cronograma de Trabajo y Carta Gantt — 18 Semanas</w:t>
+            <w:tab/>
+            <w:t w:space="preserve">17</w:t>
           </w:r>
         </w:p>
         <w:p>
           <w:pPr>
             <w:widowControl w:val="0"/>
             <w:tabs>
-              <w:tab w:val="right" w:leader="none" w:pos="12000"/>
+              <w:tab w:val="right" w:leader="dot" w:pos="9360"/>
             </w:tabs>
             <w:spacing w:after="0" w:before="60" w:line="240" w:lineRule="auto"/>
-            <w:ind w:left="720" w:firstLine="0"/>
+            <w:ind w:left="360" w:firstLine="0"/>
+          </w:pPr>
+          <w:r>
             <w:rPr>
-              <w:rFonts w:ascii="Arial" w:cs="Arial" w:eastAsia="Arial" w:hAnsi="Arial"/>
-              <w:b w:val="0"/>
-              <w:bCs w:val="0"/>
-              <w:i w:val="0"/>
-              <w:iCs w:val="0"/>
-              <w:smallCaps w:val="0"/>
-              <w:strike w:val="0"/>
+              <w:rFonts w:ascii="Calibri" w:hAnsi="Calibri" w:eastAsia="Calibri" w:cs="Calibri"/>
               <w:color w:val="000000"/>
               <w:sz w:val="22"/>
               <w:szCs w:val="22"/>
-              <w:u w:val="none"/>
-              <w:shd w:fill="auto" w:val="clear"/>
-              <w:vertAlign w:val="baseline"/>
             </w:rPr>
-          </w:pPr>
-          <w:hyperlink w:anchor="_heading=h.2z3vtuwyd7l0">
-            <w:r>
-              <w:rPr>
-                <w:rFonts w:ascii="Calibri" w:cs="Calibri" w:eastAsia="Calibri" w:hAnsi="Calibri"/>
-                <w:b w:val="0"/>
-                <w:bCs w:val="0"/>
-                <w:i w:val="0"/>
-                <w:iCs w:val="0"/>
-                <w:smallCaps w:val="0"/>
-                <w:strike w:val="0"/>
-                <w:color w:val="000000"/>
-                <w:sz w:val="22"/>
-                <w:szCs w:val="22"/>
-                <w:u w:val="none"/>
-                <w:shd w:fill="auto" w:val="clear"/>
-                <w:vertAlign w:val="baseline"/>
-                <w:rtl w:val="0"/>
-              </w:rPr>
-              <w:t xml:space="preserve">1.5.4 Factores Obstaculizadores y Plan de Mitigación</w:t>
-              <w:tab/>
-              <w:t xml:space="preserve">8</w:t>
-            </w:r>
-          </w:hyperlink>
-          <w:r>
-            <w:rPr>
-              <w:rtl w:val="0"/>
-            </w:rPr>
+            <w:t w:space="preserve">2.6 Políticas de Seguridad y Protección de la Información</w:t>
+            <w:tab/>
+            <w:t w:space="preserve">18</w:t>
           </w:r>
         </w:p>
         <w:p>
           <w:pPr>
             <w:widowControl w:val="0"/>
             <w:tabs>
-              <w:tab w:val="right" w:leader="none" w:pos="12000"/>
+              <w:tab w:val="right" w:leader="dot" w:pos="9360"/>
             </w:tabs>
             <w:spacing w:after="0" w:before="60" w:line="240" w:lineRule="auto"/>
-            <w:ind w:left="720" w:firstLine="0"/>
+            <w:ind w:left="360" w:firstLine="0"/>
+          </w:pPr>
+          <w:r>
             <w:rPr>
-              <w:rFonts w:ascii="Arial" w:cs="Arial" w:eastAsia="Arial" w:hAnsi="Arial"/>
-              <w:b w:val="0"/>
-              <w:bCs w:val="0"/>
-              <w:i w:val="0"/>
-              <w:iCs w:val="0"/>
-              <w:smallCaps w:val="0"/>
-              <w:strike w:val="0"/>
+              <w:rFonts w:ascii="Calibri" w:hAnsi="Calibri" w:eastAsia="Calibri" w:cs="Calibri"/>
               <w:color w:val="000000"/>
               <w:sz w:val="22"/>
               <w:szCs w:val="22"/>
-              <w:u w:val="none"/>
-              <w:shd w:fill="auto" w:val="clear"/>
-              <w:vertAlign w:val="baseline"/>
             </w:rPr>
-          </w:pPr>
-          <w:hyperlink w:anchor="_heading=h.8zks2l6z8zp1">
-            <w:r>
-              <w:rPr>
-                <w:rFonts w:ascii="Calibri" w:cs="Calibri" w:eastAsia="Calibri" w:hAnsi="Calibri"/>
-                <w:b w:val="0"/>
-                <w:bCs w:val="0"/>
-                <w:i w:val="0"/>
-                <w:iCs w:val="0"/>
-                <w:smallCaps w:val="0"/>
-                <w:strike w:val="0"/>
-                <w:color w:val="000000"/>
-                <w:sz w:val="22"/>
-                <w:szCs w:val="22"/>
-                <w:u w:val="none"/>
-                <w:shd w:fill="auto" w:val="clear"/>
-                <w:vertAlign w:val="baseline"/>
-                <w:rtl w:val="0"/>
-              </w:rPr>
-              <w:t xml:space="preserve">1.5.5 Modelo de Negocio e Impacto Operacional para Lumina Motion</w:t>
-              <w:tab/>
-              <w:t xml:space="preserve">8</w:t>
-            </w:r>
-          </w:hyperlink>
-          <w:r>
-            <w:rPr>
-              <w:rtl w:val="0"/>
-            </w:rPr>
+            <w:t w:space="preserve">2.7 Prototipos Visuales y Wireframes de Interfaz (Mockups UI/UX)</w:t>
+            <w:tab/>
+            <w:t w:space="preserve">19</w:t>
           </w:r>
         </w:p>
         <w:p>
           <w:pPr>
             <w:widowControl w:val="0"/>
             <w:tabs>
-              <w:tab w:val="right" w:leader="none" w:pos="12000"/>
+              <w:tab w:val="right" w:leader="dot" w:pos="9360"/>
             </w:tabs>
             <w:spacing w:after="0" w:before="60" w:line="240" w:lineRule="auto"/>
+          </w:pPr>
+          <w:r>
             <w:rPr>
-              <w:rFonts w:ascii="Arial" w:cs="Arial" w:eastAsia="Arial" w:hAnsi="Arial"/>
+              <w:rFonts w:ascii="Calibri" w:hAnsi="Calibri" w:eastAsia="Calibri" w:cs="Calibri"/>
               <w:b w:val="1"/>
               <w:bCs w:val="1"/>
-              <w:i w:val="0"/>
-              <w:iCs w:val="0"/>
-              <w:smallCaps w:val="0"/>
-              <w:strike w:val="0"/>
               <w:color w:val="000000"/>
               <w:sz w:val="22"/>
               <w:szCs w:val="22"/>
-              <w:u w:val="none"/>
-              <w:shd w:fill="auto" w:val="clear"/>
-              <w:vertAlign w:val="baseline"/>
             </w:rPr>
-          </w:pPr>
-          <w:hyperlink w:anchor="_heading=h.n4i0344bdmob">
-            <w:r>
-              <w:rPr>
-                <w:rFonts w:ascii="Calibri" w:cs="Calibri" w:eastAsia="Calibri" w:hAnsi="Calibri"/>
-                <w:b w:val="1"/>
-                <w:bCs w:val="1"/>
-                <w:i w:val="0"/>
-                <w:iCs w:val="0"/>
-                <w:smallCaps w:val="0"/>
-                <w:strike w:val="0"/>
-                <w:color w:val="000000"/>
-                <w:sz w:val="22"/>
-                <w:szCs w:val="22"/>
-                <w:u w:val="none"/>
-                <w:shd w:fill="auto" w:val="clear"/>
-                <w:vertAlign w:val="baseline"/>
-                <w:rtl w:val="0"/>
-              </w:rPr>
-              <w:t xml:space="preserve">II: OBJETIVOS, METODOLOGÍA Y PLANIFICACIÓN</w:t>
-              <w:tab/>
-              <w:t xml:space="preserve">10</w:t>
-            </w:r>
-          </w:hyperlink>
-          <w:r>
-            <w:rPr>
-              <w:rtl w:val="0"/>
-            </w:rPr>
+            <w:t w:space="preserve">III: CONCLUSIONES Y VALOR AGREGADO</w:t>
+            <w:tab/>
+            <w:t w:space="preserve">20</w:t>
           </w:r>
         </w:p>
         <w:p>
           <w:pPr>
             <w:widowControl w:val="0"/>
             <w:tabs>
-              <w:tab w:val="right" w:leader="none" w:pos="12000"/>
+              <w:tab w:val="right" w:leader="dot" w:pos="9360"/>
             </w:tabs>
             <w:spacing w:after="0" w:before="60" w:line="240" w:lineRule="auto"/>
             <w:ind w:left="360" w:firstLine="0"/>
+          </w:pPr>
+          <w:r>
             <w:rPr>
-              <w:rFonts w:ascii="Arial" w:cs="Arial" w:eastAsia="Arial" w:hAnsi="Arial"/>
-              <w:b w:val="0"/>
-              <w:bCs w:val="0"/>
-              <w:i w:val="0"/>
-              <w:iCs w:val="0"/>
-              <w:smallCaps w:val="0"/>
-              <w:strike w:val="0"/>
+              <w:rFonts w:ascii="Calibri" w:hAnsi="Calibri" w:eastAsia="Calibri" w:cs="Calibri"/>
               <w:color w:val="000000"/>
               <w:sz w:val="22"/>
               <w:szCs w:val="22"/>
-              <w:u w:val="none"/>
-              <w:shd w:fill="auto" w:val="clear"/>
-              <w:vertAlign w:val="baseline"/>
             </w:rPr>
-          </w:pPr>
-          <w:hyperlink w:anchor="_heading=h.c6nytzpz9krs">
-            <w:r>
-              <w:rPr>
-                <w:rFonts w:ascii="Calibri" w:cs="Calibri" w:eastAsia="Calibri" w:hAnsi="Calibri"/>
-                <w:b w:val="0"/>
-                <w:bCs w:val="0"/>
-                <w:i w:val="0"/>
-                <w:iCs w:val="0"/>
-                <w:smallCaps w:val="0"/>
-                <w:strike w:val="0"/>
-                <w:color w:val="000000"/>
-                <w:sz w:val="22"/>
-                <w:szCs w:val="22"/>
-                <w:u w:val="none"/>
-                <w:shd w:fill="auto" w:val="clear"/>
-                <w:vertAlign w:val="baseline"/>
-                <w:rtl w:val="0"/>
-              </w:rPr>
-              <w:t xml:space="preserve">2.1 Formulación de Objetivos</w:t>
-              <w:tab/>
-              <w:t xml:space="preserve">10</w:t>
-            </w:r>
-          </w:hyperlink>
-          <w:r>
-            <w:rPr>
-              <w:rtl w:val="0"/>
-            </w:rPr>
+            <w:t w:space="preserve">3.1 Individual Conclusions</w:t>
+            <w:tab/>
+            <w:t w:space="preserve">21</w:t>
           </w:r>
         </w:p>
         <w:p>
           <w:pPr>
             <w:widowControl w:val="0"/>
             <w:tabs>
-              <w:tab w:val="right" w:leader="none" w:pos="12000"/>
+              <w:tab w:val="right" w:leader="dot" w:pos="9360"/>
             </w:tabs>
             <w:spacing w:after="0" w:before="60" w:line="240" w:lineRule="auto"/>
-            <w:ind w:left="720" w:firstLine="0"/>
+            <w:ind w:left="360" w:firstLine="0"/>
+          </w:pPr>
+          <w:r>
             <w:rPr>
-              <w:rFonts w:ascii="Arial" w:cs="Arial" w:eastAsia="Arial" w:hAnsi="Arial"/>
-              <w:b w:val="0"/>
-              <w:bCs w:val="0"/>
-              <w:i w:val="0"/>
-              <w:iCs w:val="0"/>
-              <w:smallCaps w:val="0"/>
-              <w:strike w:val="0"/>
+              <w:rFonts w:ascii="Calibri" w:hAnsi="Calibri" w:eastAsia="Calibri" w:cs="Calibri"/>
               <w:color w:val="000000"/>
               <w:sz w:val="22"/>
               <w:szCs w:val="22"/>
-              <w:u w:val="none"/>
-              <w:shd w:fill="auto" w:val="clear"/>
-              <w:vertAlign w:val="baseline"/>
             </w:rPr>
-          </w:pPr>
-          <w:hyperlink w:anchor="_heading=h.kiovd6eb4qlc">
-            <w:r>
-              <w:rPr>
-                <w:rFonts w:ascii="Calibri" w:cs="Calibri" w:eastAsia="Calibri" w:hAnsi="Calibri"/>
-                <w:b w:val="0"/>
-                <w:bCs w:val="0"/>
-                <w:i w:val="0"/>
-                <w:iCs w:val="0"/>
-                <w:smallCaps w:val="0"/>
-                <w:strike w:val="0"/>
-                <w:color w:val="000000"/>
-                <w:sz w:val="22"/>
-                <w:szCs w:val="22"/>
-                <w:u w:val="none"/>
-                <w:shd w:fill="auto" w:val="clear"/>
-                <w:vertAlign w:val="baseline"/>
-                <w:rtl w:val="0"/>
-              </w:rPr>
-              <w:t xml:space="preserve">2.1.1 Objetivo General</w:t>
-              <w:tab/>
-              <w:t xml:space="preserve">10</w:t>
-            </w:r>
-          </w:hyperlink>
-          <w:r>
-            <w:rPr>
-              <w:rtl w:val="0"/>
-            </w:rPr>
+            <w:t w:space="preserve">3.2 Individual Reflections</w:t>
+            <w:tab/>
+            <w:t w:space="preserve">21</w:t>
           </w:r>
         </w:p>
         <w:p>
           <w:pPr>
             <w:widowControl w:val="0"/>
             <w:tabs>
-              <w:tab w:val="right" w:leader="none" w:pos="12000"/>
+              <w:tab w:val="right" w:leader="dot" w:pos="9360"/>
             </w:tabs>
             <w:spacing w:after="0" w:before="60" w:line="240" w:lineRule="auto"/>
-            <w:ind w:left="720" w:firstLine="0"/>
+          </w:pPr>
+          <w:r>
             <w:rPr>
-              <w:rFonts w:ascii="Arial" w:cs="Arial" w:eastAsia="Arial" w:hAnsi="Arial"/>
-              <w:b w:val="0"/>
-              <w:bCs w:val="0"/>
-              <w:i w:val="0"/>
-              <w:iCs w:val="0"/>
-              <w:smallCaps w:val="0"/>
-              <w:strike w:val="0"/>
+              <w:rFonts w:ascii="Calibri" w:hAnsi="Calibri" w:eastAsia="Calibri" w:cs="Calibri"/>
+              <w:b w:val="1"/>
+              <w:bCs w:val="1"/>
               <w:color w:val="000000"/>
               <w:sz w:val="22"/>
               <w:szCs w:val="22"/>
-              <w:u w:val="none"/>
-              <w:shd w:fill="auto" w:val="clear"/>
-              <w:vertAlign w:val="baseline"/>
             </w:rPr>
-          </w:pPr>
-          <w:hyperlink w:anchor="_heading=h.4i6uqzlecoiy">
-            <w:r>
-              <w:rPr>
-                <w:rFonts w:ascii="Calibri" w:cs="Calibri" w:eastAsia="Calibri" w:hAnsi="Calibri"/>
-                <w:b w:val="0"/>
-                <w:bCs w:val="0"/>
-                <w:i w:val="0"/>
-                <w:iCs w:val="0"/>
-                <w:smallCaps w:val="0"/>
-                <w:strike w:val="0"/>
-                <w:color w:val="000000"/>
-                <w:sz w:val="22"/>
-                <w:szCs w:val="22"/>
-                <w:u w:val="none"/>
-                <w:shd w:fill="auto" w:val="clear"/>
-                <w:vertAlign w:val="baseline"/>
-                <w:rtl w:val="0"/>
-              </w:rPr>
-              <w:t xml:space="preserve">2.1.2 Objetivos Específicos</w:t>
-              <w:tab/>
-              <w:t xml:space="preserve">10</w:t>
-            </w:r>
-          </w:hyperlink>
-          <w:r>
-            <w:rPr>
-              <w:rtl w:val="0"/>
-            </w:rPr>
-          </w:r>
-        </w:p>
-        <w:p>
-          <w:pPr>
-            <w:widowControl w:val="0"/>
-            <w:tabs>
-              <w:tab w:val="right" w:leader="none" w:pos="12000"/>
-            </w:tabs>
-            <w:spacing w:after="0" w:before="60" w:line="240" w:lineRule="auto"/>
-            <w:ind w:left="360" w:firstLine="0"/>
-            <w:rPr>
-              <w:rFonts w:ascii="Arial" w:cs="Arial" w:eastAsia="Arial" w:hAnsi="Arial"/>
-              <w:b w:val="0"/>
-              <w:bCs w:val="0"/>
-              <w:i w:val="0"/>
-              <w:iCs w:val="0"/>
-              <w:smallCaps w:val="0"/>
-              <w:strike w:val="0"/>
-              <w:color w:val="000000"/>
-              <w:sz w:val="22"/>
-              <w:szCs w:val="22"/>
-              <w:u w:val="none"/>
-              <w:shd w:fill="auto" w:val="clear"/>
-              <w:vertAlign w:val="baseline"/>
-            </w:rPr>
-          </w:pPr>
-          <w:hyperlink w:anchor="_heading=h.1jgg0ppegonj">
-            <w:r>
-              <w:rPr>
-                <w:rFonts w:ascii="Calibri" w:cs="Calibri" w:eastAsia="Calibri" w:hAnsi="Calibri"/>
-                <w:b w:val="0"/>
-                <w:bCs w:val="0"/>
-                <w:i w:val="0"/>
-                <w:iCs w:val="0"/>
-                <w:smallCaps w:val="0"/>
-                <w:strike w:val="0"/>
-                <w:color w:val="000000"/>
-                <w:sz w:val="22"/>
-                <w:szCs w:val="22"/>
-                <w:u w:val="none"/>
-                <w:shd w:fill="auto" w:val="clear"/>
-                <w:vertAlign w:val="baseline"/>
-                <w:rtl w:val="0"/>
-              </w:rPr>
-              <w:t xml:space="preserve">2.2 Metodología de Trabajo y Roles Disciplinares</w:t>
-              <w:tab/>
-              <w:t xml:space="preserve">11</w:t>
-            </w:r>
-          </w:hyperlink>
-          <w:r>
-            <w:rPr>
-              <w:rtl w:val="0"/>
-            </w:rPr>
-          </w:r>
-        </w:p>
-        <w:p>
-          <w:pPr>
-            <w:widowControl w:val="0"/>
-            <w:tabs>
-              <w:tab w:val="right" w:leader="none" w:pos="12000"/>
-            </w:tabs>
-            <w:spacing w:after="0" w:before="60" w:line="240" w:lineRule="auto"/>
-            <w:ind w:left="720" w:firstLine="0"/>
-            <w:rPr>
-              <w:rFonts w:ascii="Arial" w:cs="Arial" w:eastAsia="Arial" w:hAnsi="Arial"/>
-              <w:b w:val="0"/>
-              <w:bCs w:val="0"/>
-              <w:i w:val="0"/>
-              <w:iCs w:val="0"/>
-              <w:smallCaps w:val="0"/>
-              <w:strike w:val="0"/>
-              <w:color w:val="000000"/>
-              <w:sz w:val="22"/>
-              <w:szCs w:val="22"/>
-              <w:u w:val="none"/>
-              <w:shd w:fill="auto" w:val="clear"/>
-              <w:vertAlign w:val="baseline"/>
-            </w:rPr>
-          </w:pPr>
-          <w:hyperlink w:anchor="_heading=h.2qahxkqijv16">
-            <w:r>
-              <w:rPr>
-                <w:rFonts w:ascii="Calibri" w:cs="Calibri" w:eastAsia="Calibri" w:hAnsi="Calibri"/>
-                <w:b w:val="0"/>
-                <w:bCs w:val="0"/>
-                <w:i w:val="0"/>
-                <w:iCs w:val="0"/>
-                <w:smallCaps w:val="0"/>
-                <w:strike w:val="0"/>
-                <w:color w:val="000000"/>
-                <w:sz w:val="22"/>
-                <w:szCs w:val="22"/>
-                <w:u w:val="none"/>
-                <w:shd w:fill="auto" w:val="clear"/>
-                <w:vertAlign w:val="baseline"/>
-                <w:rtl w:val="0"/>
-              </w:rPr>
-              <w:t xml:space="preserve">2.2.1 Marco Metodológico: Scrum Adaptado a Proyectos de Ingeniería</w:t>
-              <w:tab/>
-              <w:t xml:space="preserve">11</w:t>
-            </w:r>
-          </w:hyperlink>
-          <w:r>
-            <w:rPr>
-              <w:rtl w:val="0"/>
-            </w:rPr>
-          </w:r>
-        </w:p>
-        <w:p>
-          <w:pPr>
-            <w:widowControl w:val="0"/>
-            <w:tabs>
-              <w:tab w:val="right" w:leader="none" w:pos="12000"/>
-            </w:tabs>
-            <w:spacing w:after="0" w:before="60" w:line="240" w:lineRule="auto"/>
-            <w:ind w:left="720" w:firstLine="0"/>
-            <w:rPr>
-              <w:rFonts w:ascii="Arial" w:cs="Arial" w:eastAsia="Arial" w:hAnsi="Arial"/>
-              <w:b w:val="0"/>
-              <w:bCs w:val="0"/>
-              <w:i w:val="0"/>
-              <w:iCs w:val="0"/>
-              <w:smallCaps w:val="0"/>
-              <w:strike w:val="0"/>
-              <w:color w:val="000000"/>
-              <w:sz w:val="22"/>
-              <w:szCs w:val="22"/>
-              <w:u w:val="none"/>
-              <w:shd w:fill="auto" w:val="clear"/>
-              <w:vertAlign w:val="baseline"/>
-            </w:rPr>
-          </w:pPr>
-          <w:hyperlink w:anchor="_heading=h.6odqy81ojh9k">
-            <w:r>
-              <w:rPr>
-                <w:rFonts w:ascii="Calibri" w:cs="Calibri" w:eastAsia="Calibri" w:hAnsi="Calibri"/>
-                <w:b w:val="0"/>
-                <w:bCs w:val="0"/>
-                <w:i w:val="0"/>
-                <w:iCs w:val="0"/>
-                <w:smallCaps w:val="0"/>
-                <w:strike w:val="0"/>
-                <w:color w:val="000000"/>
-                <w:sz w:val="22"/>
-                <w:szCs w:val="22"/>
-                <w:u w:val="none"/>
-                <w:shd w:fill="auto" w:val="clear"/>
-                <w:vertAlign w:val="baseline"/>
-                <w:rtl w:val="0"/>
-              </w:rPr>
-              <w:t xml:space="preserve">2.2.2 Funciones y Responsabilidades del Equipo</w:t>
-              <w:tab/>
-              <w:t xml:space="preserve">11</w:t>
-            </w:r>
-          </w:hyperlink>
-          <w:r>
-            <w:rPr>
-              <w:rtl w:val="0"/>
-            </w:rPr>
-          </w:r>
-        </w:p>
-        <w:p>
-          <w:pPr>
-            <w:widowControl w:val="0"/>
-            <w:tabs>
-              <w:tab w:val="right" w:leader="none" w:pos="12000"/>
-            </w:tabs>
-            <w:spacing w:after="0" w:before="60" w:line="240" w:lineRule="auto"/>
-            <w:ind w:left="360" w:firstLine="0"/>
-            <w:rPr>
-              <w:rFonts w:ascii="Arial" w:cs="Arial" w:eastAsia="Arial" w:hAnsi="Arial"/>
-              <w:b w:val="0"/>
-              <w:bCs w:val="0"/>
-              <w:i w:val="0"/>
-              <w:iCs w:val="0"/>
-              <w:smallCaps w:val="0"/>
-              <w:strike w:val="0"/>
-              <w:color w:val="000000"/>
-              <w:sz w:val="22"/>
-              <w:szCs w:val="22"/>
-              <w:u w:val="none"/>
-              <w:shd w:fill="auto" w:val="clear"/>
-              <w:vertAlign w:val="baseline"/>
-            </w:rPr>
-          </w:pPr>
-          <w:hyperlink w:anchor="_heading=h.6bunf7rcq2lf">
-            <w:r>
-              <w:rPr>
-                <w:rFonts w:ascii="Calibri" w:cs="Calibri" w:eastAsia="Calibri" w:hAnsi="Calibri"/>
-                <w:b w:val="0"/>
-                <w:bCs w:val="0"/>
-                <w:i w:val="0"/>
-                <w:iCs w:val="0"/>
-                <w:smallCaps w:val="0"/>
-                <w:strike w:val="0"/>
-                <w:color w:val="000000"/>
-                <w:sz w:val="22"/>
-                <w:szCs w:val="22"/>
-                <w:u w:val="none"/>
-                <w:shd w:fill="auto" w:val="clear"/>
-                <w:vertAlign w:val="baseline"/>
-                <w:rtl w:val="0"/>
-              </w:rPr>
-              <w:t xml:space="preserve">2.3 Plan de Trabajo Articulado por Competencias</w:t>
-              <w:tab/>
-              <w:t xml:space="preserve">12</w:t>
-            </w:r>
-          </w:hyperlink>
-          <w:r>
-            <w:rPr>
-              <w:rtl w:val="0"/>
-            </w:rPr>
-          </w:r>
-        </w:p>
-        <w:p>
-          <w:pPr>
-            <w:widowControl w:val="0"/>
-            <w:tabs>
-              <w:tab w:val="right" w:leader="none" w:pos="12000"/>
-            </w:tabs>
-            <w:spacing w:after="0" w:before="60" w:line="240" w:lineRule="auto"/>
-            <w:ind w:left="360" w:firstLine="0"/>
-            <w:rPr>
-              <w:rFonts w:ascii="Arial" w:cs="Arial" w:eastAsia="Arial" w:hAnsi="Arial"/>
-              <w:b w:val="0"/>
-              <w:bCs w:val="0"/>
-              <w:i w:val="0"/>
-              <w:iCs w:val="0"/>
-              <w:smallCaps w:val="0"/>
-              <w:strike w:val="0"/>
-              <w:color w:val="000000"/>
-              <w:sz w:val="22"/>
-              <w:szCs w:val="22"/>
-              <w:u w:val="none"/>
-              <w:shd w:fill="auto" w:val="clear"/>
-              <w:vertAlign w:val="baseline"/>
-            </w:rPr>
-          </w:pPr>
-          <w:hyperlink w:anchor="_heading=h.w2hixefaoh6o">
-            <w:r>
-              <w:rPr>
-                <w:rFonts w:ascii="Calibri" w:cs="Calibri" w:eastAsia="Calibri" w:hAnsi="Calibri"/>
-                <w:b w:val="0"/>
-                <w:bCs w:val="0"/>
-                <w:i w:val="0"/>
-                <w:iCs w:val="0"/>
-                <w:smallCaps w:val="0"/>
-                <w:strike w:val="0"/>
-                <w:color w:val="000000"/>
-                <w:sz w:val="22"/>
-                <w:szCs w:val="22"/>
-                <w:u w:val="none"/>
-                <w:shd w:fill="auto" w:val="clear"/>
-                <w:vertAlign w:val="baseline"/>
-                <w:rtl w:val="0"/>
-              </w:rPr>
-              <w:t xml:space="preserve">2.4 Determinación y Justificación de Evidencias</w:t>
-              <w:tab/>
-              <w:t xml:space="preserve">15</w:t>
-            </w:r>
-          </w:hyperlink>
-          <w:r>
-            <w:rPr>
-              <w:rtl w:val="0"/>
-            </w:rPr>
-          </w:r>
-        </w:p>
-        <w:p>
-          <w:pPr>
-            <w:widowControl w:val="0"/>
-            <w:tabs>
-              <w:tab w:val="right" w:leader="none" w:pos="12000"/>
-            </w:tabs>
-            <w:spacing w:after="0" w:before="60" w:line="240" w:lineRule="auto"/>
-            <w:ind w:left="360" w:firstLine="0"/>
-            <w:rPr>
-              <w:rFonts w:ascii="Arial" w:cs="Arial" w:eastAsia="Arial" w:hAnsi="Arial"/>
-              <w:b w:val="0"/>
-              <w:bCs w:val="0"/>
-              <w:i w:val="0"/>
-              <w:iCs w:val="0"/>
-              <w:smallCaps w:val="0"/>
-              <w:strike w:val="0"/>
-              <w:color w:val="000000"/>
-              <w:sz w:val="22"/>
-              <w:szCs w:val="22"/>
-              <w:u w:val="none"/>
-              <w:shd w:fill="auto" w:val="clear"/>
-              <w:vertAlign w:val="baseline"/>
-            </w:rPr>
-          </w:pPr>
-          <w:hyperlink w:anchor="_heading=h.ddmcy04ctvzk">
-            <w:r>
-              <w:rPr>
-                <w:rFonts w:ascii="Calibri" w:cs="Calibri" w:eastAsia="Calibri" w:hAnsi="Calibri"/>
-                <w:b w:val="0"/>
-                <w:bCs w:val="0"/>
-                <w:i w:val="0"/>
-                <w:iCs w:val="0"/>
-                <w:smallCaps w:val="0"/>
-                <w:strike w:val="0"/>
-                <w:color w:val="000000"/>
-                <w:sz w:val="22"/>
-                <w:szCs w:val="22"/>
-                <w:u w:val="none"/>
-                <w:shd w:fill="auto" w:val="clear"/>
-                <w:vertAlign w:val="baseline"/>
-                <w:rtl w:val="0"/>
-              </w:rPr>
-              <w:t xml:space="preserve">2.5 Cronograma de Trabajo y Carta Gantt — 18 Semanas</w:t>
-              <w:tab/>
-              <w:t xml:space="preserve">16</w:t>
-            </w:r>
-          </w:hyperlink>
-          <w:r>
-            <w:rPr>
-              <w:rtl w:val="0"/>
-            </w:rPr>
-          </w:r>
-        </w:p>
-        <w:p>
-          <w:pPr>
-            <w:widowControl w:val="0"/>
-            <w:tabs>
-              <w:tab w:val="right" w:leader="none" w:pos="12000"/>
-            </w:tabs>
-            <w:spacing w:after="0" w:before="60" w:line="240" w:lineRule="auto"/>
-            <w:ind w:left="360" w:firstLine="0"/>
-            <w:rPr>
-              <w:rFonts w:ascii="Arial" w:cs="Arial" w:eastAsia="Arial" w:hAnsi="Arial"/>
-              <w:b w:val="0"/>
-              <w:bCs w:val="0"/>
-              <w:i w:val="0"/>
-              <w:iCs w:val="0"/>
-              <w:smallCaps w:val="0"/>
-              <w:strike w:val="0"/>
-              <w:color w:val="000000"/>
-              <w:sz w:val="22"/>
-              <w:szCs w:val="22"/>
-              <w:u w:val="none"/>
-              <w:shd w:fill="auto" w:val="clear"/>
-              <w:vertAlign w:val="baseline"/>
-            </w:rPr>
-          </w:pPr>
-          <w:hyperlink w:anchor="_heading=h.ul9lkf47iicy">
-            <w:r>
-              <w:rPr>
-                <w:rFonts w:ascii="Calibri" w:cs="Calibri" w:eastAsia="Calibri" w:hAnsi="Calibri"/>
-                <w:b w:val="0"/>
-                <w:bCs w:val="0"/>
-                <w:i w:val="0"/>
-                <w:iCs w:val="0"/>
-                <w:smallCaps w:val="0"/>
-                <w:strike w:val="0"/>
-                <w:color w:val="000000"/>
-                <w:sz w:val="22"/>
-                <w:szCs w:val="22"/>
-                <w:u w:val="none"/>
-                <w:shd w:fill="auto" w:val="clear"/>
-                <w:vertAlign w:val="baseline"/>
-                <w:rtl w:val="0"/>
-              </w:rPr>
-              <w:t xml:space="preserve">2.6 Políticas de Seguridad y Protección de la Información</w:t>
-              <w:tab/>
-              <w:t xml:space="preserve">17</w:t>
-            </w:r>
-          </w:hyperlink>
-          <w:r>
-            <w:rPr>
-              <w:rtl w:val="0"/>
-            </w:rPr>
-          </w:r>
-        </w:p>
-        <w:p>
-          <w:pPr>
-            <w:widowControl w:val="0"/>
-            <w:tabs>
-              <w:tab w:val="right" w:leader="none" w:pos="12000"/>
-            </w:tabs>
-            <w:spacing w:after="0" w:before="60" w:line="240" w:lineRule="auto"/>
-            <w:ind w:left="360" w:firstLine="0"/>
-            <w:rPr>
-              <w:rFonts w:ascii="Arial" w:cs="Arial" w:eastAsia="Arial" w:hAnsi="Arial"/>
-              <w:b w:val="0"/>
-              <w:bCs w:val="0"/>
-              <w:i w:val="0"/>
-              <w:iCs w:val="0"/>
-              <w:smallCaps w:val="0"/>
-              <w:strike w:val="0"/>
-              <w:color w:val="000000"/>
-              <w:sz w:val="22"/>
-              <w:szCs w:val="22"/>
-              <w:u w:val="none"/>
-              <w:shd w:fill="auto" w:val="clear"/>
-              <w:vertAlign w:val="baseline"/>
-            </w:rPr>
-          </w:pPr>
-          <w:hyperlink w:anchor="_heading=h.5o25aydkdzbb">
-            <w:r>
-              <w:rPr>
-                <w:rFonts w:ascii="Calibri" w:cs="Calibri" w:eastAsia="Calibri" w:hAnsi="Calibri"/>
-                <w:b w:val="0"/>
-                <w:bCs w:val="0"/>
-                <w:i w:val="0"/>
-                <w:iCs w:val="0"/>
-                <w:smallCaps w:val="0"/>
-                <w:strike w:val="0"/>
-                <w:color w:val="000000"/>
-                <w:sz w:val="22"/>
-                <w:szCs w:val="22"/>
-                <w:u w:val="none"/>
-                <w:shd w:fill="auto" w:val="clear"/>
-                <w:vertAlign w:val="baseline"/>
-                <w:rtl w:val="0"/>
-              </w:rPr>
-              <w:t xml:space="preserve">2.7 Prototipos Visuales y Wireframes de Interfaz (Mockups UI/UX)</w:t>
-              <w:tab/>
-              <w:t xml:space="preserve">17</w:t>
-            </w:r>
-          </w:hyperlink>
-          <w:r>
-            <w:rPr>
-              <w:rtl w:val="0"/>
-            </w:rPr>
-          </w:r>
-        </w:p>
-        <w:p>
-          <w:pPr>
-            <w:widowControl w:val="0"/>
-            <w:tabs>
-              <w:tab w:val="right" w:leader="none" w:pos="12000"/>
-            </w:tabs>
-            <w:spacing w:after="0" w:before="60" w:line="240" w:lineRule="auto"/>
-            <w:rPr>
-              <w:rFonts w:ascii="Arial" w:cs="Arial" w:eastAsia="Arial" w:hAnsi="Arial"/>
-              <w:b w:val="1"/>
-              <w:bCs w:val="1"/>
-              <w:i w:val="0"/>
-              <w:iCs w:val="0"/>
-              <w:smallCaps w:val="0"/>
-              <w:strike w:val="0"/>
-              <w:color w:val="000000"/>
-              <w:sz w:val="22"/>
-              <w:szCs w:val="22"/>
-              <w:u w:val="none"/>
-              <w:shd w:fill="auto" w:val="clear"/>
-              <w:vertAlign w:val="baseline"/>
-            </w:rPr>
-          </w:pPr>
-          <w:hyperlink w:anchor="_heading=h.bxchr6a8t4q5">
-            <w:r>
-              <w:rPr>
-                <w:rFonts w:ascii="Calibri" w:cs="Calibri" w:eastAsia="Calibri" w:hAnsi="Calibri"/>
-                <w:b w:val="1"/>
-                <w:bCs w:val="1"/>
-                <w:i w:val="0"/>
-                <w:iCs w:val="0"/>
-                <w:smallCaps w:val="0"/>
-                <w:strike w:val="0"/>
-                <w:color w:val="000000"/>
-                <w:sz w:val="22"/>
-                <w:szCs w:val="22"/>
-                <w:u w:val="none"/>
-                <w:shd w:fill="auto" w:val="clear"/>
-                <w:vertAlign w:val="baseline"/>
-                <w:rtl w:val="0"/>
-              </w:rPr>
-              <w:t xml:space="preserve">III: CONCLUSIONES Y VALOR AGREGADO</w:t>
-              <w:tab/>
-              <w:t xml:space="preserve">18</w:t>
-            </w:r>
-          </w:hyperlink>
-          <w:r>
-            <w:rPr>
-              <w:rtl w:val="0"/>
-            </w:rPr>
-          </w:r>
-        </w:p>
-        <w:p>
-          <w:pPr>
-            <w:widowControl w:val="0"/>
-            <w:tabs>
-              <w:tab w:val="right" w:leader="none" w:pos="12000"/>
-            </w:tabs>
-            <w:spacing w:after="0" w:before="60" w:line="240" w:lineRule="auto"/>
-            <w:rPr>
-              <w:rFonts w:ascii="Arial" w:cs="Arial" w:eastAsia="Arial" w:hAnsi="Arial"/>
-              <w:b w:val="1"/>
-              <w:bCs w:val="1"/>
-              <w:i w:val="0"/>
-              <w:iCs w:val="0"/>
-              <w:smallCaps w:val="0"/>
-              <w:strike w:val="0"/>
-              <w:color w:val="000000"/>
-              <w:sz w:val="22"/>
-              <w:szCs w:val="22"/>
-              <w:u w:val="none"/>
-              <w:shd w:fill="auto" w:val="clear"/>
-              <w:vertAlign w:val="baseline"/>
-            </w:rPr>
-          </w:pPr>
-          <w:hyperlink w:anchor="_heading=h.g76ws4uo1mqi">
-            <w:r>
-              <w:rPr>
-                <w:rFonts w:ascii="Calibri" w:cs="Calibri" w:eastAsia="Calibri" w:hAnsi="Calibri"/>
-                <w:b w:val="1"/>
-                <w:bCs w:val="1"/>
-                <w:i w:val="0"/>
-                <w:iCs w:val="0"/>
-                <w:smallCaps w:val="0"/>
-                <w:strike w:val="0"/>
-                <w:color w:val="000000"/>
-                <w:sz w:val="22"/>
-                <w:szCs w:val="22"/>
-                <w:u w:val="none"/>
-                <w:shd w:fill="auto" w:val="clear"/>
-                <w:vertAlign w:val="baseline"/>
-                <w:rtl w:val="0"/>
-              </w:rPr>
-              <w:t xml:space="preserve">IV: REFERENCIAS BIBLIOGRÁFICAS</w:t>
-              <w:tab/>
-              <w:t xml:space="preserve">19</w:t>
-            </w:r>
-          </w:hyperlink>
-          <w:r>
-            <w:rPr>
-              <w:rtl w:val="0"/>
-            </w:rPr>
-          </w:r>
-          <w:r>
-            <w:fldChar w:fldCharType="end"/>
+            <w:t w:space="preserve">IV: REFERENCIAS BIBLIOGRÁFICAS</w:t>
+            <w:tab/>
+            <w:t w:space="preserve">23</w:t>
           </w:r>
         </w:p>
       </w:sdtContent>
@@ -2504,6 +1306,36 @@
     <w:p>
       <w:pPr>
         <w:pStyle w:val="Heading1"/>
+        <w:pageBreakBefore/>
+      </w:pPr>
+      <w:r>
+        <w:t>ABSTRACT</w:t>
+      </w:r>
+    </w:p>
+    <w:p>
+      <w:pPr/>
+      <w:r>
+        <w:t>ACE (Autonomous Content Engine) is a software project defined within the Capstone course (PTY4614) of the Computer Engineering program at Duoc UC, Antonio Varas campus. The project addresses the fragmented management of digital signage at Lumina Motion Studio, where content updates, screen control, and scheduling currently rely on separate tools and on-site intervention. ACE proposes a centralized web platform for managing locations, sectors, screens, media, playlists, and schedules. It also considers local player nodes that cache validated content and keep the active schedule running during internet outages. The proposed architecture combines a Laravel-based central application, MariaDB persistence, REST and WebSocket communication, local storage, and file-integrity verification. The work is organized across an 18-week academic period with iterative cycles and milestones for project definition, functional progress, consolidated delivery, and final defense. Responsibilities are divided among software architecture and backend development, project management and client coordination, and frontend, database, and technical documentation tasks. This first phase establishes the scope, objectives, feasibility, methodology, evidence plan, and implementation roadmap required for subsequent development and validation with Lumina Motion.</w:t>
+      </w:r>
+    </w:p>
+    <w:p>
+      <w:pPr>
+        <w:pStyle w:val="Heading1"/>
+      </w:pPr>
+      <w:r>
+        <w:t>RESUMEN</w:t>
+      </w:r>
+    </w:p>
+    <w:p>
+      <w:pPr/>
+      <w:r>
+        <w:t>ACE (Autonomous Content Engine) es un proyecto de software definido en la asignatura Capstone (PTY4614) de Ingeniería en Informática de Duoc UC, sede Antonio Varas. El proyecto aborda la gestión fragmentada de la cartelería digital de Lumina Motion Studio, donde la actualización de contenidos, el control de pantallas y la programación dependen actualmente de herramientas separadas y de intervención presencial. ACE propone una plataforma web centralizada para administrar locaciones, sectores, pantallas, medios, listas de reproducción y horarios. También contempla reproductores locales que almacenan contenido validado y mantienen la programación activa durante interrupciones de internet. La arquitectura propuesta combina una aplicación central basada en Laravel, persistencia en MariaDB, comunicación REST y WebSocket, almacenamiento local y verificación de integridad de archivos. El trabajo se organiza durante 18 semanas mediante ciclos iterativos e hitos de definición, avance funcional, entrega consolidada y defensa final. Esta primera fase establece el alcance, los objetivos, la factibilidad, la metodología, el plan de evidencias y la hoja de ruta necesarios para desarrollar y validar la solución con Lumina Motion.</w:t>
+      </w:r>
+    </w:p>
+    <w:p>
+      <w:pPr>
+        <w:pStyle w:val="Heading1"/>
+        <w:pageBreakBefore/>
         <w:rPr/>
       </w:pPr>
       <w:bookmarkStart w:colFirst="0" w:colLast="0" w:name="_heading=h.tsvaipc2dt49" w:id="3"/>
@@ -6063,6 +4895,7 @@
     <w:p>
       <w:pPr>
         <w:pStyle w:val="Heading3"/>
+        <w:keepNext/>
         <w:rPr/>
       </w:pPr>
       <w:bookmarkStart w:colFirst="0" w:colLast="0" w:name="_heading=h.8zks2l6z8zp1" w:id="19"/>
@@ -6100,6 +4933,7 @@
     </w:p>
     <w:p>
       <w:pPr>
+        <w:keepLines/>
         <w:rPr>
           <w:rFonts w:ascii="Calibri" w:cs="Calibri" w:eastAsia="Calibri" w:hAnsi="Calibri"/>
         </w:rPr>
@@ -13853,7 +12687,125 @@
     </w:p>
     <w:p>
       <w:pPr>
+        <w:pStyle w:val="Heading2"/>
+        <w:keepNext/>
+        <w:pageBreakBefore/>
+        <w:spacing w:before="280" w:after="80"/>
+      </w:pPr>
+      <w:r>
+        <w:t>3.1 Individual Conclusions</w:t>
+      </w:r>
+    </w:p>
+    <w:p>
+      <w:pPr>
+        <w:pStyle w:val="Heading3"/>
+        <w:keepNext/>
+        <w:spacing w:before="200" w:after="40"/>
+      </w:pPr>
+      <w:r>
+        <w:t>3.1.1 Tomás Escalante</w:t>
+      </w:r>
+    </w:p>
+    <w:p>
+      <w:pPr/>
+      <w:r>
+        <w:t>From my perspective, the definition phase confirmed that offline resilience must shape the architecture from the beginning rather than be treated as a later feature. The central platform and the local players need explicit responsibilities, stable data contracts, and a synchronization strategy that protects current playback when connectivity is unavailable. The agreed scope gives me a concrete basis for the backend, APIs, device authentication, and telemetry work. My main conclusion is that the technical complexity remains manageable if every decision is tied to a verifiable requirement and implemented incrementally. The next phase should therefore turn the proposed architecture into small, testable services while keeping the project within the academic schedule.</w:t>
+      </w:r>
+    </w:p>
+    <w:p>
+      <w:pPr>
+        <w:pStyle w:val="Heading3"/>
+        <w:keepNext/>
+        <w:spacing w:before="200" w:after="40"/>
+      </w:pPr>
+      <w:r>
+        <w:t>3.1.2 Paulo Loyola</w:t>
+      </w:r>
+    </w:p>
+    <w:p>
+      <w:pPr/>
+      <w:r>
+        <w:t>The definition phase showed me that frontend development, database design, and technical documentation are not separate concerns. The administration interface can only be clear if permissions, locations, screens, media, and schedules are modeled consistently, while documentation must preserve the reasons behind those decisions. ACE gives me a concrete opportunity to apply my interest in user interfaces and structured technical work to a real operational problem. My main conclusion is that usability and traceability must be designed alongside implementation. In the next phase, I will focus on making the administrative workflows understandable, connecting them to a coherent data model, and documenting the evidence needed to demonstrate progress.</w:t>
+      </w:r>
+    </w:p>
+    <w:p>
+      <w:pPr>
+        <w:pStyle w:val="Heading3"/>
+        <w:keepNext/>
+        <w:spacing w:before="200" w:after="40"/>
+      </w:pPr>
+      <w:r>
+        <w:t>3.1.3 Matías Salas</w:t>
+      </w:r>
+    </w:p>
+    <w:p>
+      <w:pPr/>
+      <w:r>
+        <w:t>The definition phase confirmed that the project is feasible only if scope, client validation, and technical work remain coordinated. The 18-week plan makes dependencies and evaluation milestones visible, but it must be treated as a working plan that is reviewed against actual progress and feedback from Lumina Motion. My role connects project management, the local player, and client communication, so I need to ensure that technical decisions can be explained and validated in operational terms. My main conclusion is that continuous verification with the client will reduce rework and keep the team focused on the minimum viable product rather than on features outside the agreed scope.</w:t>
+      </w:r>
+    </w:p>
+    <w:p>
+      <w:pPr>
+        <w:pStyle w:val="Heading2"/>
+        <w:keepNext/>
+        <w:spacing w:before="280" w:after="80"/>
+      </w:pPr>
+      <w:r>
+        <w:t>3.2 Individual Reflections</w:t>
+      </w:r>
+    </w:p>
+    <w:p>
+      <w:pPr>
+        <w:pStyle w:val="Heading3"/>
+        <w:keepNext/>
+        <w:spacing w:before="200" w:after="40"/>
+      </w:pPr>
+      <w:r>
+        <w:t>3.2.1 Tomás Escalante</w:t>
+      </w:r>
+    </w:p>
+    <w:p>
+      <w:pPr/>
+      <w:r>
+        <w:t>This phase helped me connect my professional interest in software architecture and backend development with a concrete continuity requirement. Designing for unreliable connectivity requires more than choosing technologies: it requires clear boundaries, predictable state transitions, and evidence that the player continues operating safely. During the next phase, I will focus on translating the proposed architecture into testable contracts and on documenting the assumptions behind synchronization, authentication, and telemetry. This will help me strengthen the link between architectural decisions and measurable product behavior.</w:t>
+      </w:r>
+    </w:p>
+    <w:p>
+      <w:pPr>
+        <w:pStyle w:val="Heading3"/>
+        <w:keepNext/>
+        <w:spacing w:before="200" w:after="40"/>
+      </w:pPr>
+      <w:r>
+        <w:t>3.2.2 Paulo Loyola</w:t>
+      </w:r>
+    </w:p>
+    <w:p>
+      <w:pPr/>
+      <w:r>
+        <w:t>This phase allowed me to connect my interest in frontend development, databases, and technical documentation with the daily needs of an operator. I need to ensure that the interface does not merely display data, but helps users understand permissions, screen status, available content, and scheduling decisions. In the next phase, I will focus on maintaining consistency between the interface and the data model, while recording the technical evidence required by the project. This work will help me strengthen my ability to design usable workflows without losing traceability or technical precision.</w:t>
+      </w:r>
+    </w:p>
+    <w:p>
+      <w:pPr>
+        <w:pStyle w:val="Heading3"/>
+        <w:keepNext/>
+        <w:spacing w:before="200" w:after="40"/>
+      </w:pPr>
+      <w:r>
+        <w:t>3.2.3 Matías Salas</w:t>
+      </w:r>
+    </w:p>
+    <w:p>
+      <w:pPr/>
+      <w:r>
+        <w:t>This phase connected my interest in project management, software development, and client interaction with the practical challenge of keeping the team aligned. A detailed schedule is useful only when it reflects real dependencies and is updated through evidence and client feedback. During the next phase, I will focus on converting validation meetings into clear acceptance criteria, monitoring risks that affect the local player, and keeping the scope realistic. This will help me strengthen the transition from coordination and planning to measurable delivery.</w:t>
+      </w:r>
+    </w:p>
+    <w:p>
+      <w:pPr>
         <w:pStyle w:val="Heading1"/>
+        <w:pageBreakBefore/>
         <w:rPr/>
       </w:pPr>
       <w:bookmarkStart w:colFirst="0" w:colLast="0" w:name="_heading=h.g76ws4uo1mqi" w:id="33"/>

</xml_diff>